<commit_message>
Add Week 5 & 6 course materials (assessments, reading notes, lecture plans), article drafts, and agent system config; gitignore nested book repo
</commit_message>
<xml_diff>
--- a/Week 4 - APIs, Cloud Computing & SDLC.docx
+++ b/Week 4 - APIs, Cloud Computing & SDLC.docx
@@ -58,6 +58,16 @@
           <w:szCs w:val="32"/>
         </w:rPr>
         <w:t>WEEK 4</w:t>
+      </w:r>
+      <w:r>
+        <w:rPr>
+          <w:rFonts w:asciiTheme="minorHAnsi" w:hAnsiTheme="minorHAnsi"/>
+          <w:b/>
+          <w:color w:val="1A3C5E"/>
+          <w:sz w:val="32"/>
+          <w:szCs w:val="32"/>
+        </w:rPr>
+        <w:t xml:space="preserve"> </w:t>
       </w:r>
     </w:p>
     <w:p>

</xml_diff>